<commit_message>
Assign exercise staff roles
</commit_message>
<xml_diff>
--- a/produksjon_farrisbrua/02_Ressursplan_B43_Farrisbrua.docx
+++ b/produksjon_farrisbrua/02_Ressursplan_B43_Farrisbrua.docx
@@ -1192,7 +1192,1114 @@
         <w:pStyle w:val="Heading1"/>
       </w:pPr>
       <w:r>
-        <w:t>3. Kanaler og praktisk bruk</w:t>
+        <w:t>3. Personfordeling for gruppe 3 og spillstab</w:t>
+      </w:r>
+    </w:p>
+    <w:p>
+      <w:r>
+        <w:t>Gruppe 3 eier øvelsen. To fra gruppe 3 sitter i kontrollrommet som observatører, og to fra gruppe 3 inngår i spillstab. Gruppe 1 støtter med innringere og motspill.</w:t>
+      </w:r>
+    </w:p>
+    <w:tbl>
+      <w:tblPr>
+        <w:tblStyle w:val="TableGrid"/>
+        <w:tblW w:type="auto" w:w="0"/>
+        <w:tblLayout w:type="autofit"/>
+        <w:tblLook w:firstColumn="1" w:firstRow="1" w:lastColumn="0" w:lastRow="0" w:noHBand="0" w:noVBand="1" w:val="04A0"/>
+      </w:tblPr>
+      <w:tblGrid>
+        <w:gridCol w:w="2074"/>
+        <w:gridCol w:w="2074"/>
+        <w:gridCol w:w="2074"/>
+        <w:gridCol w:w="2074"/>
+        <w:gridCol w:w="2074"/>
+      </w:tblGrid>
+      <w:tr>
+        <w:tc>
+          <w:tcPr>
+            <w:tcW w:type="dxa" w:w="2074"/>
+            <w:vAlign w:val="top"/>
+            <w:shd w:fill="203864"/>
+            <w:shd w:fill="203864"/>
+          </w:tcPr>
+          <w:p>
+            <w:pPr>
+              <w:spacing w:after="40" w:line="252" w:lineRule="auto"/>
+            </w:pPr>
+            <w:r>
+              <w:rPr>
+                <w:b/>
+                <w:color w:val="FFFFFF"/>
+                <w:sz w:val="17"/>
+              </w:rPr>
+            </w:r>
+            <w:r>
+              <w:rPr>
+                <w:b/>
+                <w:color w:val="FFFFFF"/>
+                <w:sz w:val="17"/>
+              </w:rPr>
+              <w:t>Person</w:t>
+            </w:r>
+          </w:p>
+        </w:tc>
+        <w:tc>
+          <w:tcPr>
+            <w:tcW w:type="dxa" w:w="2074"/>
+            <w:vAlign w:val="top"/>
+            <w:shd w:fill="203864"/>
+            <w:shd w:fill="203864"/>
+          </w:tcPr>
+          <w:p>
+            <w:pPr>
+              <w:spacing w:after="40" w:line="252" w:lineRule="auto"/>
+            </w:pPr>
+            <w:r>
+              <w:rPr>
+                <w:b/>
+                <w:color w:val="FFFFFF"/>
+                <w:sz w:val="17"/>
+              </w:rPr>
+            </w:r>
+            <w:r>
+              <w:rPr>
+                <w:b/>
+                <w:color w:val="FFFFFF"/>
+                <w:sz w:val="17"/>
+              </w:rPr>
+              <w:t>Gruppe</w:t>
+            </w:r>
+          </w:p>
+        </w:tc>
+        <w:tc>
+          <w:tcPr>
+            <w:tcW w:type="dxa" w:w="2074"/>
+            <w:vAlign w:val="top"/>
+            <w:shd w:fill="203864"/>
+            <w:shd w:fill="203864"/>
+          </w:tcPr>
+          <w:p>
+            <w:pPr>
+              <w:spacing w:after="40" w:line="252" w:lineRule="auto"/>
+            </w:pPr>
+            <w:r>
+              <w:rPr>
+                <w:b/>
+                <w:color w:val="FFFFFF"/>
+                <w:sz w:val="17"/>
+              </w:rPr>
+            </w:r>
+            <w:r>
+              <w:rPr>
+                <w:b/>
+                <w:color w:val="FFFFFF"/>
+                <w:sz w:val="17"/>
+              </w:rPr>
+              <w:t>Plassering</w:t>
+            </w:r>
+          </w:p>
+        </w:tc>
+        <w:tc>
+          <w:tcPr>
+            <w:tcW w:type="dxa" w:w="2074"/>
+            <w:vAlign w:val="top"/>
+            <w:shd w:fill="203864"/>
+            <w:shd w:fill="203864"/>
+          </w:tcPr>
+          <w:p>
+            <w:pPr>
+              <w:spacing w:after="40" w:line="252" w:lineRule="auto"/>
+            </w:pPr>
+            <w:r>
+              <w:rPr>
+                <w:b/>
+                <w:color w:val="FFFFFF"/>
+                <w:sz w:val="17"/>
+              </w:rPr>
+            </w:r>
+            <w:r>
+              <w:rPr>
+                <w:b/>
+                <w:color w:val="FFFFFF"/>
+                <w:sz w:val="17"/>
+              </w:rPr>
+              <w:t>Rolle</w:t>
+            </w:r>
+          </w:p>
+        </w:tc>
+        <w:tc>
+          <w:tcPr>
+            <w:tcW w:type="dxa" w:w="2074"/>
+            <w:vAlign w:val="top"/>
+            <w:shd w:fill="203864"/>
+            <w:shd w:fill="203864"/>
+          </w:tcPr>
+          <w:p>
+            <w:pPr>
+              <w:spacing w:after="40" w:line="252" w:lineRule="auto"/>
+            </w:pPr>
+            <w:r>
+              <w:rPr>
+                <w:b/>
+                <w:color w:val="FFFFFF"/>
+                <w:sz w:val="17"/>
+              </w:rPr>
+            </w:r>
+            <w:r>
+              <w:rPr>
+                <w:b/>
+                <w:color w:val="FFFFFF"/>
+                <w:sz w:val="17"/>
+              </w:rPr>
+              <w:t>Primæransvar</w:t>
+            </w:r>
+          </w:p>
+        </w:tc>
+      </w:tr>
+      <w:tr>
+        <w:tc>
+          <w:tcPr>
+            <w:tcW w:type="dxa" w:w="2074"/>
+            <w:vAlign w:val="top"/>
+          </w:tcPr>
+          <w:p>
+            <w:pPr>
+              <w:spacing w:after="40" w:line="252" w:lineRule="auto"/>
+            </w:pPr>
+            <w:r>
+              <w:rPr>
+                <w:sz w:val="17"/>
+              </w:rPr>
+            </w:r>
+            <w:r>
+              <w:rPr>
+                <w:b w:val="0"/>
+                <w:sz w:val="17"/>
+              </w:rPr>
+              <w:t>Rune</w:t>
+            </w:r>
+          </w:p>
+        </w:tc>
+        <w:tc>
+          <w:tcPr>
+            <w:tcW w:type="dxa" w:w="2074"/>
+            <w:vAlign w:val="top"/>
+          </w:tcPr>
+          <w:p>
+            <w:pPr>
+              <w:spacing w:after="40" w:line="252" w:lineRule="auto"/>
+            </w:pPr>
+            <w:r>
+              <w:rPr>
+                <w:sz w:val="17"/>
+              </w:rPr>
+            </w:r>
+            <w:r>
+              <w:rPr>
+                <w:b w:val="0"/>
+                <w:sz w:val="17"/>
+              </w:rPr>
+              <w:t>Gruppe 3</w:t>
+            </w:r>
+          </w:p>
+        </w:tc>
+        <w:tc>
+          <w:tcPr>
+            <w:tcW w:type="dxa" w:w="2074"/>
+            <w:vAlign w:val="top"/>
+          </w:tcPr>
+          <w:p>
+            <w:pPr>
+              <w:spacing w:after="40" w:line="252" w:lineRule="auto"/>
+            </w:pPr>
+            <w:r>
+              <w:rPr>
+                <w:sz w:val="17"/>
+              </w:rPr>
+            </w:r>
+            <w:r>
+              <w:rPr>
+                <w:b w:val="0"/>
+                <w:sz w:val="17"/>
+              </w:rPr>
+              <w:t>Spillstab</w:t>
+            </w:r>
+          </w:p>
+        </w:tc>
+        <w:tc>
+          <w:tcPr>
+            <w:tcW w:type="dxa" w:w="2074"/>
+            <w:vAlign w:val="top"/>
+          </w:tcPr>
+          <w:p>
+            <w:pPr>
+              <w:spacing w:after="40" w:line="252" w:lineRule="auto"/>
+            </w:pPr>
+            <w:r>
+              <w:rPr>
+                <w:sz w:val="17"/>
+              </w:rPr>
+            </w:r>
+            <w:r>
+              <w:rPr>
+                <w:b w:val="0"/>
+                <w:sz w:val="17"/>
+              </w:rPr>
+              <w:t>Øvingsleder / spill-leder</w:t>
+            </w:r>
+          </w:p>
+        </w:tc>
+        <w:tc>
+          <w:tcPr>
+            <w:tcW w:type="dxa" w:w="2074"/>
+            <w:vAlign w:val="top"/>
+          </w:tcPr>
+          <w:p>
+            <w:pPr>
+              <w:spacing w:after="40" w:line="252" w:lineRule="auto"/>
+            </w:pPr>
+            <w:r>
+              <w:rPr>
+                <w:sz w:val="17"/>
+              </w:rPr>
+            </w:r>
+            <w:r>
+              <w:rPr>
+                <w:b w:val="0"/>
+                <w:sz w:val="17"/>
+              </w:rPr>
+              <w:t>Start/stopp, tempo, avvik fra dreiebok og overgang til AAR.</w:t>
+            </w:r>
+          </w:p>
+        </w:tc>
+      </w:tr>
+      <w:tr>
+        <w:tc>
+          <w:tcPr>
+            <w:tcW w:type="dxa" w:w="2074"/>
+            <w:vAlign w:val="top"/>
+          </w:tcPr>
+          <w:p>
+            <w:pPr>
+              <w:spacing w:after="40" w:line="252" w:lineRule="auto"/>
+            </w:pPr>
+            <w:r>
+              <w:rPr>
+                <w:sz w:val="17"/>
+              </w:rPr>
+            </w:r>
+            <w:r>
+              <w:rPr>
+                <w:b w:val="0"/>
+                <w:sz w:val="17"/>
+              </w:rPr>
+              <w:t>Mats</w:t>
+            </w:r>
+          </w:p>
+        </w:tc>
+        <w:tc>
+          <w:tcPr>
+            <w:tcW w:type="dxa" w:w="2074"/>
+            <w:vAlign w:val="top"/>
+          </w:tcPr>
+          <w:p>
+            <w:pPr>
+              <w:spacing w:after="40" w:line="252" w:lineRule="auto"/>
+            </w:pPr>
+            <w:r>
+              <w:rPr>
+                <w:sz w:val="17"/>
+              </w:rPr>
+            </w:r>
+            <w:r>
+              <w:rPr>
+                <w:b w:val="0"/>
+                <w:sz w:val="17"/>
+              </w:rPr>
+              <w:t>Gruppe 3</w:t>
+            </w:r>
+          </w:p>
+        </w:tc>
+        <w:tc>
+          <w:tcPr>
+            <w:tcW w:type="dxa" w:w="2074"/>
+            <w:vAlign w:val="top"/>
+          </w:tcPr>
+          <w:p>
+            <w:pPr>
+              <w:spacing w:after="40" w:line="252" w:lineRule="auto"/>
+            </w:pPr>
+            <w:r>
+              <w:rPr>
+                <w:sz w:val="17"/>
+              </w:rPr>
+            </w:r>
+            <w:r>
+              <w:rPr>
+                <w:b w:val="0"/>
+                <w:sz w:val="17"/>
+              </w:rPr>
+              <w:t>Spillstab</w:t>
+            </w:r>
+          </w:p>
+        </w:tc>
+        <w:tc>
+          <w:tcPr>
+            <w:tcW w:type="dxa" w:w="2074"/>
+            <w:vAlign w:val="top"/>
+          </w:tcPr>
+          <w:p>
+            <w:pPr>
+              <w:spacing w:after="40" w:line="252" w:lineRule="auto"/>
+            </w:pPr>
+            <w:r>
+              <w:rPr>
+                <w:sz w:val="17"/>
+              </w:rPr>
+            </w:r>
+            <w:r>
+              <w:rPr>
+                <w:b w:val="0"/>
+                <w:sz w:val="17"/>
+              </w:rPr>
+              <w:t>Brannressurser / teknisk spill</w:t>
+            </w:r>
+          </w:p>
+        </w:tc>
+        <w:tc>
+          <w:tcPr>
+            <w:tcW w:type="dxa" w:w="2074"/>
+            <w:vAlign w:val="top"/>
+          </w:tcPr>
+          <w:p>
+            <w:pPr>
+              <w:spacing w:after="40" w:line="252" w:lineRule="auto"/>
+            </w:pPr>
+            <w:r>
+              <w:rPr>
+                <w:sz w:val="17"/>
+              </w:rPr>
+            </w:r>
+            <w:r>
+              <w:rPr>
+                <w:b w:val="0"/>
+                <w:sz w:val="17"/>
+              </w:rPr>
+              <w:t>Spiller B43-01, B43-09/UL og IL brann etter dreiebok.</w:t>
+            </w:r>
+          </w:p>
+        </w:tc>
+      </w:tr>
+      <w:tr>
+        <w:tc>
+          <w:tcPr>
+            <w:tcW w:type="dxa" w:w="2074"/>
+            <w:vAlign w:val="top"/>
+          </w:tcPr>
+          <w:p>
+            <w:pPr>
+              <w:spacing w:after="40" w:line="252" w:lineRule="auto"/>
+            </w:pPr>
+            <w:r>
+              <w:rPr>
+                <w:sz w:val="17"/>
+              </w:rPr>
+            </w:r>
+            <w:r>
+              <w:rPr>
+                <w:b w:val="0"/>
+                <w:sz w:val="17"/>
+              </w:rPr>
+              <w:t>Siw</w:t>
+            </w:r>
+          </w:p>
+        </w:tc>
+        <w:tc>
+          <w:tcPr>
+            <w:tcW w:type="dxa" w:w="2074"/>
+            <w:vAlign w:val="top"/>
+          </w:tcPr>
+          <w:p>
+            <w:pPr>
+              <w:spacing w:after="40" w:line="252" w:lineRule="auto"/>
+            </w:pPr>
+            <w:r>
+              <w:rPr>
+                <w:sz w:val="17"/>
+              </w:rPr>
+            </w:r>
+            <w:r>
+              <w:rPr>
+                <w:b w:val="0"/>
+                <w:sz w:val="17"/>
+              </w:rPr>
+              <w:t>Gruppe 3</w:t>
+            </w:r>
+          </w:p>
+        </w:tc>
+        <w:tc>
+          <w:tcPr>
+            <w:tcW w:type="dxa" w:w="2074"/>
+            <w:vAlign w:val="top"/>
+          </w:tcPr>
+          <w:p>
+            <w:pPr>
+              <w:spacing w:after="40" w:line="252" w:lineRule="auto"/>
+            </w:pPr>
+            <w:r>
+              <w:rPr>
+                <w:sz w:val="17"/>
+              </w:rPr>
+            </w:r>
+            <w:r>
+              <w:rPr>
+                <w:b w:val="0"/>
+                <w:sz w:val="17"/>
+              </w:rPr>
+              <w:t>Kontrollrom</w:t>
+            </w:r>
+          </w:p>
+        </w:tc>
+        <w:tc>
+          <w:tcPr>
+            <w:tcW w:type="dxa" w:w="2074"/>
+            <w:vAlign w:val="top"/>
+          </w:tcPr>
+          <w:p>
+            <w:pPr>
+              <w:spacing w:after="40" w:line="252" w:lineRule="auto"/>
+            </w:pPr>
+            <w:r>
+              <w:rPr>
+                <w:sz w:val="17"/>
+              </w:rPr>
+            </w:r>
+            <w:r>
+              <w:rPr>
+                <w:b w:val="0"/>
+                <w:sz w:val="17"/>
+              </w:rPr>
+              <w:t>Observatør 1</w:t>
+            </w:r>
+          </w:p>
+        </w:tc>
+        <w:tc>
+          <w:tcPr>
+            <w:tcW w:type="dxa" w:w="2074"/>
+            <w:vAlign w:val="top"/>
+          </w:tcPr>
+          <w:p>
+            <w:pPr>
+              <w:spacing w:after="40" w:line="252" w:lineRule="auto"/>
+            </w:pPr>
+            <w:r>
+              <w:rPr>
+                <w:sz w:val="17"/>
+              </w:rPr>
+            </w:r>
+            <w:r>
+              <w:rPr>
+                <w:b w:val="0"/>
+                <w:sz w:val="17"/>
+              </w:rPr>
+              <w:t>D1/D3: mottak, utalarmering, trippelvarsling og samvirke.</w:t>
+            </w:r>
+          </w:p>
+        </w:tc>
+      </w:tr>
+      <w:tr>
+        <w:tc>
+          <w:tcPr>
+            <w:tcW w:type="dxa" w:w="2074"/>
+            <w:vAlign w:val="top"/>
+          </w:tcPr>
+          <w:p>
+            <w:pPr>
+              <w:spacing w:after="40" w:line="252" w:lineRule="auto"/>
+            </w:pPr>
+            <w:r>
+              <w:rPr>
+                <w:sz w:val="17"/>
+              </w:rPr>
+            </w:r>
+            <w:r>
+              <w:rPr>
+                <w:b w:val="0"/>
+                <w:sz w:val="17"/>
+              </w:rPr>
+              <w:t>Tom Christian</w:t>
+            </w:r>
+          </w:p>
+        </w:tc>
+        <w:tc>
+          <w:tcPr>
+            <w:tcW w:type="dxa" w:w="2074"/>
+            <w:vAlign w:val="top"/>
+          </w:tcPr>
+          <w:p>
+            <w:pPr>
+              <w:spacing w:after="40" w:line="252" w:lineRule="auto"/>
+            </w:pPr>
+            <w:r>
+              <w:rPr>
+                <w:sz w:val="17"/>
+              </w:rPr>
+            </w:r>
+            <w:r>
+              <w:rPr>
+                <w:b w:val="0"/>
+                <w:sz w:val="17"/>
+              </w:rPr>
+              <w:t>Gruppe 3</w:t>
+            </w:r>
+          </w:p>
+        </w:tc>
+        <w:tc>
+          <w:tcPr>
+            <w:tcW w:type="dxa" w:w="2074"/>
+            <w:vAlign w:val="top"/>
+          </w:tcPr>
+          <w:p>
+            <w:pPr>
+              <w:spacing w:after="40" w:line="252" w:lineRule="auto"/>
+            </w:pPr>
+            <w:r>
+              <w:rPr>
+                <w:sz w:val="17"/>
+              </w:rPr>
+            </w:r>
+            <w:r>
+              <w:rPr>
+                <w:b w:val="0"/>
+                <w:sz w:val="17"/>
+              </w:rPr>
+              <w:t>Kontrollrom</w:t>
+            </w:r>
+          </w:p>
+        </w:tc>
+        <w:tc>
+          <w:tcPr>
+            <w:tcW w:type="dxa" w:w="2074"/>
+            <w:vAlign w:val="top"/>
+          </w:tcPr>
+          <w:p>
+            <w:pPr>
+              <w:spacing w:after="40" w:line="252" w:lineRule="auto"/>
+            </w:pPr>
+            <w:r>
+              <w:rPr>
+                <w:sz w:val="17"/>
+              </w:rPr>
+            </w:r>
+            <w:r>
+              <w:rPr>
+                <w:b w:val="0"/>
+                <w:sz w:val="17"/>
+              </w:rPr>
+              <w:t>Observatør 2</w:t>
+            </w:r>
+          </w:p>
+        </w:tc>
+        <w:tc>
+          <w:tcPr>
+            <w:tcW w:type="dxa" w:w="2074"/>
+            <w:vAlign w:val="top"/>
+          </w:tcPr>
+          <w:p>
+            <w:pPr>
+              <w:spacing w:after="40" w:line="252" w:lineRule="auto"/>
+            </w:pPr>
+            <w:r>
+              <w:rPr>
+                <w:sz w:val="17"/>
+              </w:rPr>
+            </w:r>
+            <w:r>
+              <w:rPr>
+                <w:b w:val="0"/>
+                <w:sz w:val="17"/>
+              </w:rPr>
+              <w:t>D2/D4/D5: situasjonsbilde, rollefordeling, driftsfase og sluttstatus.</w:t>
+            </w:r>
+          </w:p>
+        </w:tc>
+      </w:tr>
+      <w:tr>
+        <w:tc>
+          <w:tcPr>
+            <w:tcW w:type="dxa" w:w="2074"/>
+            <w:vAlign w:val="top"/>
+          </w:tcPr>
+          <w:p>
+            <w:pPr>
+              <w:spacing w:after="40" w:line="252" w:lineRule="auto"/>
+            </w:pPr>
+            <w:r>
+              <w:rPr>
+                <w:sz w:val="17"/>
+              </w:rPr>
+            </w:r>
+            <w:r>
+              <w:rPr>
+                <w:b w:val="0"/>
+                <w:sz w:val="17"/>
+              </w:rPr>
+              <w:t>Vibecke</w:t>
+            </w:r>
+          </w:p>
+        </w:tc>
+        <w:tc>
+          <w:tcPr>
+            <w:tcW w:type="dxa" w:w="2074"/>
+            <w:vAlign w:val="top"/>
+          </w:tcPr>
+          <w:p>
+            <w:pPr>
+              <w:spacing w:after="40" w:line="252" w:lineRule="auto"/>
+            </w:pPr>
+            <w:r>
+              <w:rPr>
+                <w:sz w:val="17"/>
+              </w:rPr>
+            </w:r>
+            <w:r>
+              <w:rPr>
+                <w:b w:val="0"/>
+                <w:sz w:val="17"/>
+              </w:rPr>
+              <w:t>Gruppe 1</w:t>
+            </w:r>
+          </w:p>
+        </w:tc>
+        <w:tc>
+          <w:tcPr>
+            <w:tcW w:type="dxa" w:w="2074"/>
+            <w:vAlign w:val="top"/>
+          </w:tcPr>
+          <w:p>
+            <w:pPr>
+              <w:spacing w:after="40" w:line="252" w:lineRule="auto"/>
+            </w:pPr>
+            <w:r>
+              <w:rPr>
+                <w:sz w:val="17"/>
+              </w:rPr>
+            </w:r>
+            <w:r>
+              <w:rPr>
+                <w:b w:val="0"/>
+                <w:sz w:val="17"/>
+              </w:rPr>
+              <w:t>Spillstab</w:t>
+            </w:r>
+          </w:p>
+        </w:tc>
+        <w:tc>
+          <w:tcPr>
+            <w:tcW w:type="dxa" w:w="2074"/>
+            <w:vAlign w:val="top"/>
+          </w:tcPr>
+          <w:p>
+            <w:pPr>
+              <w:spacing w:after="40" w:line="252" w:lineRule="auto"/>
+            </w:pPr>
+            <w:r>
+              <w:rPr>
+                <w:sz w:val="17"/>
+              </w:rPr>
+            </w:r>
+            <w:r>
+              <w:rPr>
+                <w:b w:val="0"/>
+                <w:sz w:val="17"/>
+              </w:rPr>
+              <w:t>Første melder / bildestøtte</w:t>
+            </w:r>
+          </w:p>
+        </w:tc>
+        <w:tc>
+          <w:tcPr>
+            <w:tcW w:type="dxa" w:w="2074"/>
+            <w:vAlign w:val="top"/>
+          </w:tcPr>
+          <w:p>
+            <w:pPr>
+              <w:spacing w:after="40" w:line="252" w:lineRule="auto"/>
+            </w:pPr>
+            <w:r>
+              <w:rPr>
+                <w:sz w:val="17"/>
+              </w:rPr>
+            </w:r>
+            <w:r>
+              <w:rPr>
+                <w:b w:val="0"/>
+                <w:sz w:val="17"/>
+              </w:rPr>
+              <w:t>Spiller innringer 1 og støtter bilde 1-2 etter avtale.</w:t>
+            </w:r>
+          </w:p>
+        </w:tc>
+      </w:tr>
+      <w:tr>
+        <w:tc>
+          <w:tcPr>
+            <w:tcW w:type="dxa" w:w="2074"/>
+            <w:vAlign w:val="top"/>
+          </w:tcPr>
+          <w:p>
+            <w:pPr>
+              <w:spacing w:after="40" w:line="252" w:lineRule="auto"/>
+            </w:pPr>
+            <w:r>
+              <w:rPr>
+                <w:sz w:val="17"/>
+              </w:rPr>
+            </w:r>
+            <w:r>
+              <w:rPr>
+                <w:b w:val="0"/>
+                <w:sz w:val="17"/>
+              </w:rPr>
+              <w:t>Benjamin</w:t>
+            </w:r>
+          </w:p>
+        </w:tc>
+        <w:tc>
+          <w:tcPr>
+            <w:tcW w:type="dxa" w:w="2074"/>
+            <w:vAlign w:val="top"/>
+          </w:tcPr>
+          <w:p>
+            <w:pPr>
+              <w:spacing w:after="40" w:line="252" w:lineRule="auto"/>
+            </w:pPr>
+            <w:r>
+              <w:rPr>
+                <w:sz w:val="17"/>
+              </w:rPr>
+            </w:r>
+            <w:r>
+              <w:rPr>
+                <w:b w:val="0"/>
+                <w:sz w:val="17"/>
+              </w:rPr>
+              <w:t>Gruppe 1</w:t>
+            </w:r>
+          </w:p>
+        </w:tc>
+        <w:tc>
+          <w:tcPr>
+            <w:tcW w:type="dxa" w:w="2074"/>
+            <w:vAlign w:val="top"/>
+          </w:tcPr>
+          <w:p>
+            <w:pPr>
+              <w:spacing w:after="40" w:line="252" w:lineRule="auto"/>
+            </w:pPr>
+            <w:r>
+              <w:rPr>
+                <w:sz w:val="17"/>
+              </w:rPr>
+            </w:r>
+            <w:r>
+              <w:rPr>
+                <w:b w:val="0"/>
+                <w:sz w:val="17"/>
+              </w:rPr>
+              <w:t>Spillstab</w:t>
+            </w:r>
+          </w:p>
+        </w:tc>
+        <w:tc>
+          <w:tcPr>
+            <w:tcW w:type="dxa" w:w="2074"/>
+            <w:vAlign w:val="top"/>
+          </w:tcPr>
+          <w:p>
+            <w:pPr>
+              <w:spacing w:after="40" w:line="252" w:lineRule="auto"/>
+            </w:pPr>
+            <w:r>
+              <w:rPr>
+                <w:sz w:val="17"/>
+              </w:rPr>
+            </w:r>
+            <w:r>
+              <w:rPr>
+                <w:b w:val="0"/>
+                <w:sz w:val="17"/>
+              </w:rPr>
+              <w:t>Andre/tredje melder + VTS</w:t>
+            </w:r>
+          </w:p>
+        </w:tc>
+        <w:tc>
+          <w:tcPr>
+            <w:tcW w:type="dxa" w:w="2074"/>
+            <w:vAlign w:val="top"/>
+          </w:tcPr>
+          <w:p>
+            <w:pPr>
+              <w:spacing w:after="40" w:line="252" w:lineRule="auto"/>
+            </w:pPr>
+            <w:r>
+              <w:rPr>
+                <w:sz w:val="17"/>
+              </w:rPr>
+            </w:r>
+            <w:r>
+              <w:rPr>
+                <w:b w:val="0"/>
+                <w:sz w:val="17"/>
+              </w:rPr>
+              <w:t>Spiller innringer 2 og 3, samt VTS ved trafikkavklaringer.</w:t>
+            </w:r>
+          </w:p>
+        </w:tc>
+      </w:tr>
+      <w:tr>
+        <w:tc>
+          <w:tcPr>
+            <w:tcW w:type="dxa" w:w="2074"/>
+            <w:vAlign w:val="top"/>
+          </w:tcPr>
+          <w:p>
+            <w:pPr>
+              <w:spacing w:after="40" w:line="252" w:lineRule="auto"/>
+            </w:pPr>
+            <w:r>
+              <w:rPr>
+                <w:sz w:val="17"/>
+              </w:rPr>
+            </w:r>
+            <w:r>
+              <w:rPr>
+                <w:b w:val="0"/>
+                <w:sz w:val="17"/>
+              </w:rPr>
+              <w:t>Johannes</w:t>
+            </w:r>
+          </w:p>
+        </w:tc>
+        <w:tc>
+          <w:tcPr>
+            <w:tcW w:type="dxa" w:w="2074"/>
+            <w:vAlign w:val="top"/>
+          </w:tcPr>
+          <w:p>
+            <w:pPr>
+              <w:spacing w:after="40" w:line="252" w:lineRule="auto"/>
+            </w:pPr>
+            <w:r>
+              <w:rPr>
+                <w:sz w:val="17"/>
+              </w:rPr>
+            </w:r>
+            <w:r>
+              <w:rPr>
+                <w:b w:val="0"/>
+                <w:sz w:val="17"/>
+              </w:rPr>
+              <w:t>Gruppe 1</w:t>
+            </w:r>
+          </w:p>
+        </w:tc>
+        <w:tc>
+          <w:tcPr>
+            <w:tcW w:type="dxa" w:w="2074"/>
+            <w:vAlign w:val="top"/>
+          </w:tcPr>
+          <w:p>
+            <w:pPr>
+              <w:spacing w:after="40" w:line="252" w:lineRule="auto"/>
+            </w:pPr>
+            <w:r>
+              <w:rPr>
+                <w:sz w:val="17"/>
+              </w:rPr>
+            </w:r>
+            <w:r>
+              <w:rPr>
+                <w:b w:val="0"/>
+                <w:sz w:val="17"/>
+              </w:rPr>
+              <w:t>Spillstab</w:t>
+            </w:r>
+          </w:p>
+        </w:tc>
+        <w:tc>
+          <w:tcPr>
+            <w:tcW w:type="dxa" w:w="2074"/>
+            <w:vAlign w:val="top"/>
+          </w:tcPr>
+          <w:p>
+            <w:pPr>
+              <w:spacing w:after="40" w:line="252" w:lineRule="auto"/>
+            </w:pPr>
+            <w:r>
+              <w:rPr>
+                <w:sz w:val="17"/>
+              </w:rPr>
+            </w:r>
+            <w:r>
+              <w:rPr>
+                <w:b w:val="0"/>
+                <w:sz w:val="17"/>
+              </w:rPr>
+              <w:t>AMK</w:t>
+            </w:r>
+          </w:p>
+        </w:tc>
+        <w:tc>
+          <w:tcPr>
+            <w:tcW w:type="dxa" w:w="2074"/>
+            <w:vAlign w:val="top"/>
+          </w:tcPr>
+          <w:p>
+            <w:pPr>
+              <w:spacing w:after="40" w:line="252" w:lineRule="auto"/>
+            </w:pPr>
+            <w:r>
+              <w:rPr>
+                <w:sz w:val="17"/>
+              </w:rPr>
+            </w:r>
+            <w:r>
+              <w:rPr>
+                <w:b w:val="0"/>
+                <w:sz w:val="17"/>
+              </w:rPr>
+              <w:t>Spiller AMK i trippel og skade-/pasientavklaringer.</w:t>
+            </w:r>
+          </w:p>
+        </w:tc>
+      </w:tr>
+      <w:tr>
+        <w:tc>
+          <w:tcPr>
+            <w:tcW w:type="dxa" w:w="2074"/>
+            <w:vAlign w:val="top"/>
+          </w:tcPr>
+          <w:p>
+            <w:pPr>
+              <w:spacing w:after="40" w:line="252" w:lineRule="auto"/>
+            </w:pPr>
+            <w:r>
+              <w:rPr>
+                <w:sz w:val="17"/>
+              </w:rPr>
+            </w:r>
+            <w:r>
+              <w:rPr>
+                <w:b w:val="0"/>
+                <w:sz w:val="17"/>
+              </w:rPr>
+              <w:t>Ruben</w:t>
+            </w:r>
+          </w:p>
+        </w:tc>
+        <w:tc>
+          <w:tcPr>
+            <w:tcW w:type="dxa" w:w="2074"/>
+            <w:vAlign w:val="top"/>
+          </w:tcPr>
+          <w:p>
+            <w:pPr>
+              <w:spacing w:after="40" w:line="252" w:lineRule="auto"/>
+            </w:pPr>
+            <w:r>
+              <w:rPr>
+                <w:sz w:val="17"/>
+              </w:rPr>
+            </w:r>
+            <w:r>
+              <w:rPr>
+                <w:b w:val="0"/>
+                <w:sz w:val="17"/>
+              </w:rPr>
+              <w:t>Gruppe 1</w:t>
+            </w:r>
+          </w:p>
+        </w:tc>
+        <w:tc>
+          <w:tcPr>
+            <w:tcW w:type="dxa" w:w="2074"/>
+            <w:vAlign w:val="top"/>
+          </w:tcPr>
+          <w:p>
+            <w:pPr>
+              <w:spacing w:after="40" w:line="252" w:lineRule="auto"/>
+            </w:pPr>
+            <w:r>
+              <w:rPr>
+                <w:sz w:val="17"/>
+              </w:rPr>
+            </w:r>
+            <w:r>
+              <w:rPr>
+                <w:b w:val="0"/>
+                <w:sz w:val="17"/>
+              </w:rPr>
+              <w:t>Spillstab</w:t>
+            </w:r>
+          </w:p>
+        </w:tc>
+        <w:tc>
+          <w:tcPr>
+            <w:tcW w:type="dxa" w:w="2074"/>
+            <w:vAlign w:val="top"/>
+          </w:tcPr>
+          <w:p>
+            <w:pPr>
+              <w:spacing w:after="40" w:line="252" w:lineRule="auto"/>
+            </w:pPr>
+            <w:r>
+              <w:rPr>
+                <w:sz w:val="17"/>
+              </w:rPr>
+            </w:r>
+            <w:r>
+              <w:rPr>
+                <w:b w:val="0"/>
+                <w:sz w:val="17"/>
+              </w:rPr>
+              <w:t>Politi / militær kolonneleder</w:t>
+            </w:r>
+          </w:p>
+        </w:tc>
+        <w:tc>
+          <w:tcPr>
+            <w:tcW w:type="dxa" w:w="2074"/>
+            <w:vAlign w:val="top"/>
+          </w:tcPr>
+          <w:p>
+            <w:pPr>
+              <w:spacing w:after="40" w:line="252" w:lineRule="auto"/>
+            </w:pPr>
+            <w:r>
+              <w:rPr>
+                <w:sz w:val="17"/>
+              </w:rPr>
+            </w:r>
+            <w:r>
+              <w:rPr>
+                <w:b w:val="0"/>
+                <w:sz w:val="17"/>
+              </w:rPr>
+              <w:t>Spiller politi og enkel kolonnelederavklaring via politi.</w:t>
+            </w:r>
+          </w:p>
+        </w:tc>
+      </w:tr>
+    </w:tbl>
+    <w:p/>
+    <w:p>
+      <w:pPr>
+        <w:pStyle w:val="Heading1"/>
+      </w:pPr>
+      <w:r>
+        <w:t>4. Kanaler og praktisk bruk</w:t>
       </w:r>
     </w:p>
     <w:tbl>
@@ -1655,7 +2762,7 @@
         <w:pStyle w:val="Heading1"/>
       </w:pPr>
       <w:r>
-        <w:t>4. Ressursutvikling i spillet</w:t>
+        <w:t>5. Ressursutvikling i spillet</w:t>
       </w:r>
     </w:p>
     <w:tbl>
@@ -2262,7 +3369,7 @@
         <w:pStyle w:val="Heading1"/>
       </w:pPr>
       <w:r>
-        <w:t>5. Foreslått rollefordeling for vaktlaget</w:t>
+        <w:t>6. Foreslått rollefordeling for vaktlaget</w:t>
       </w:r>
     </w:p>
     <w:p>

</xml_diff>